<commit_message>
Document the hidden free-chat mode in TECHNICAL.md and rebuild TECHNICAL.docx
Co-Authored-By: Claude Fable 5.1 <noreply@anthropic.com>
Claude-Session: https://claude.ai/code/session_01K5Pu4QXr26jCZh1nMAxmJj
</commit_message>
<xml_diff>
--- a/docs/TECHNICAL.docx
+++ b/docs/TECHNICAL.docx
@@ -14111,6 +14111,102 @@
                 <w:szCs w:val="24"/>
                 <w:lang w:val="ru-RU" w:eastAsia="en-US" w:bidi="ar-SA"/>
               </w:rPr>
+              <w:t>Скрытый чат</w:t>
+            </w:r>
+          </w:p>
+        </w:tc>
+        <w:tc>
+          <w:tcPr>
+            <w:tcW w:w="3120" w:type="dxa"/>
+            <w:tcBorders/>
+          </w:tcPr>
+          <w:p>
+            <w:pPr>
+              <w:pStyle w:val="Compact"/>
+              <w:widowControl/>
+              <w:spacing w:before="36" w:after="36"/>
+              <w:jc w:val="left"/>
+              <w:rPr>
+                <w:rFonts w:ascii="Cambria" w:hAnsi="Cambria" w:eastAsia="Cambria" w:cs=""/>
+                <w:kern w:val="0"/>
+                <w:sz w:val="24"/>
+                <w:szCs w:val="24"/>
+                <w:lang w:val="ru-RU" w:eastAsia="en-US" w:bidi="ar-SA"/>
+              </w:rPr>
+            </w:pPr>
+            <w:r>
+              <w:rPr>
+                <w:rStyle w:val="VerbatimChar"/>
+                <w:rFonts w:eastAsia="Cambria" w:cs=""/>
+                <w:kern w:val="0"/>
+                <w:szCs w:val="24"/>
+                <w:lang w:val="ru-RU" w:eastAsia="en-US" w:bidi="ar-SA"/>
+              </w:rPr>
+              <w:t>openFreeChat</w:t>
+            </w:r>
+          </w:p>
+        </w:tc>
+        <w:tc>
+          <w:tcPr>
+            <w:tcW w:w="3120" w:type="dxa"/>
+            <w:tcBorders/>
+          </w:tcPr>
+          <w:p>
+            <w:pPr>
+              <w:pStyle w:val="Compact"/>
+              <w:widowControl/>
+              <w:spacing w:before="36" w:after="36"/>
+              <w:jc w:val="left"/>
+              <w:rPr>
+                <w:rFonts w:ascii="Cambria" w:hAnsi="Cambria" w:eastAsia="Cambria" w:cs=""/>
+                <w:kern w:val="0"/>
+                <w:sz w:val="24"/>
+                <w:szCs w:val="24"/>
+                <w:lang w:val="ru-RU" w:eastAsia="en-US" w:bidi="ar-SA"/>
+              </w:rPr>
+            </w:pPr>
+            <w:r>
+              <w:rPr>
+                <w:rFonts w:eastAsia="Cambria" w:cs=""/>
+                <w:kern w:val="0"/>
+                <w:sz w:val="24"/>
+                <w:szCs w:val="24"/>
+                <w:lang w:val="ru-RU" w:eastAsia="en-US" w:bidi="ar-SA"/>
+              </w:rPr>
+              <w:t>Модальное окно свободного диалога с моделью; открывается двойным кликом по кнопке «Проверить» (см. 9.5)</w:t>
+            </w:r>
+          </w:p>
+        </w:tc>
+      </w:tr>
+      <w:tr>
+        <w:trPr/>
+        <w:tc>
+          <w:tcPr>
+            <w:tcW w:w="3120" w:type="dxa"/>
+            <w:tcBorders/>
+          </w:tcPr>
+          <w:p>
+            <w:pPr>
+              <w:pStyle w:val="Compact"/>
+              <w:widowControl/>
+              <w:spacing w:before="36" w:after="36"/>
+              <w:jc w:val="left"/>
+              <w:rPr>
+                <w:rFonts w:ascii="Cambria" w:hAnsi="Cambria" w:eastAsia="Cambria" w:cs=""/>
+                <w:kern w:val="0"/>
+                <w:sz w:val="24"/>
+                <w:szCs w:val="24"/>
+                <w:lang w:val="ru-RU" w:eastAsia="en-US" w:bidi="ar-SA"/>
+              </w:rPr>
+            </w:pPr>
+            <w:r>
+              <w:rPr>
+                <w:rFonts w:eastAsia="Cambria" w:cs=""/>
+                <w:kern w:val="0"/>
+                <w:sz w:val="24"/>
+                <w:szCs w:val="24"/>
+                <w:lang w:val="ru-RU" w:eastAsia="en-US" w:bidi="ar-SA"/>
+              </w:rPr>
               <w:t>Настройки</w:t>
             </w:r>
           </w:p>
@@ -17183,8 +17279,7 @@
         <w:pStyle w:val="Normal"/>
         <w:rPr/>
       </w:pPr>
-      <w:bookmarkStart w:id="41" w:name="ии-ассистент-srcai"/>
-      <w:bookmarkStart w:id="42" w:name="config.js"/>
+      <w:bookmarkStart w:id="41" w:name="config.js"/>
       <w:r>
         <w:rPr/>
         <mc:AlternateContent>
@@ -17241,14 +17336,1100 @@
         </mc:AlternateContent>
       </w:r>
       <w:bookmarkEnd w:id="41"/>
-      <w:bookmarkEnd w:id="42"/>
     </w:p>
     <w:p>
       <w:pPr>
+        <w:pStyle w:val="Heading3"/>
+        <w:rPr/>
+      </w:pPr>
+      <w:bookmarkStart w:id="42" w:name="скрытый-режим-свободный-чат-с-моделью"/>
+      <w:r>
+        <w:rPr/>
+        <w:t>9.5. Скрытый режим: свободный чат с моделью</w:t>
+      </w:r>
+    </w:p>
+    <w:p>
+      <w:pPr>
+        <w:pStyle w:val="FirstParagraph"/>
+        <w:rPr/>
+      </w:pPr>
+      <w:r>
+        <w:rPr/>
+        <w:t xml:space="preserve">Недокументированная в интерфейсе возможность: </w:t>
+      </w:r>
+      <w:r>
+        <w:rPr>
+          <w:b/>
+          <w:bCs/>
+        </w:rPr>
+        <w:t>двойной клик по кнопке «Проверить»</w:t>
+      </w:r>
+      <w:r>
+        <w:rPr/>
+        <w:t xml:space="preserve"> во вкладке «ИИ-ассистент» открывает модальное окно </w:t>
+      </w:r>
+      <w:r>
+        <w:rPr>
+          <w:rStyle w:val="VerbatimChar"/>
+        </w:rPr>
+        <w:t>💬 Чат с моделью</w:t>
+      </w:r>
+      <w:r>
+        <w:rPr/>
+        <w:t xml:space="preserve">. Реализация — функция </w:t>
+      </w:r>
+      <w:r>
+        <w:rPr>
+          <w:rStyle w:val="VerbatimChar"/>
+        </w:rPr>
+        <w:t>openFreeChat()</w:t>
+      </w:r>
+      <w:r>
+        <w:rPr/>
+        <w:t xml:space="preserve"> в </w:t>
+      </w:r>
+      <w:r>
+        <w:rPr>
+          <w:rStyle w:val="VerbatimChar"/>
+        </w:rPr>
+        <w:t>src/app.js</w:t>
+      </w:r>
+      <w:r>
+        <w:rPr/>
+        <w:t>.</w:t>
+      </w:r>
+    </w:p>
+    <w:tbl>
+      <w:tblPr>
+        <w:tblStyle w:val="Table"/>
+        <w:tblW w:w="5000" w:type="pct"/>
+        <w:jc w:val="left"/>
+        <w:tblInd w:w="108" w:type="dxa"/>
+        <w:tblLayout w:type="fixed"/>
+        <w:tblCellMar>
+          <w:top w:w="0" w:type="dxa"/>
+          <w:left w:w="108" w:type="dxa"/>
+          <w:bottom w:w="0" w:type="dxa"/>
+          <w:right w:w="108" w:type="dxa"/>
+        </w:tblCellMar>
+        <w:tblLook w:val="0020" w:noHBand="0" w:noVBand="0" w:firstColumn="0" w:lastRow="0" w:lastColumn="0" w:firstRow="1"/>
+      </w:tblPr>
+      <w:tblGrid>
+        <w:gridCol w:w="4679"/>
+        <w:gridCol w:w="4680"/>
+      </w:tblGrid>
+      <w:tr>
+        <w:trPr>
+          <w:tblHeader w:val="true"/>
+        </w:trPr>
+        <w:tc>
+          <w:tcPr>
+            <w:tcW w:w="4679" w:type="dxa"/>
+            <w:tcBorders>
+              <w:bottom w:val="single" w:sz="6" w:space="0" w:color="000000"/>
+            </w:tcBorders>
+            <w:vAlign w:val="bottom"/>
+          </w:tcPr>
+          <w:p>
+            <w:pPr>
+              <w:pStyle w:val="Compact"/>
+              <w:widowControl/>
+              <w:spacing w:before="36" w:after="36"/>
+              <w:jc w:val="left"/>
+              <w:rPr>
+                <w:rFonts w:ascii="Cambria" w:hAnsi="Cambria" w:eastAsia="Cambria" w:cs=""/>
+                <w:kern w:val="0"/>
+                <w:sz w:val="24"/>
+                <w:szCs w:val="24"/>
+                <w:lang w:val="ru-RU" w:eastAsia="en-US" w:bidi="ar-SA"/>
+              </w:rPr>
+            </w:pPr>
+            <w:r>
+              <w:rPr>
+                <w:rFonts w:eastAsia="Cambria" w:cs=""/>
+                <w:kern w:val="0"/>
+                <w:sz w:val="24"/>
+                <w:szCs w:val="24"/>
+                <w:lang w:val="ru-RU" w:eastAsia="en-US" w:bidi="ar-SA"/>
+              </w:rPr>
+              <w:t>Аспект</w:t>
+            </w:r>
+          </w:p>
+        </w:tc>
+        <w:tc>
+          <w:tcPr>
+            <w:tcW w:w="4680" w:type="dxa"/>
+            <w:tcBorders>
+              <w:bottom w:val="single" w:sz="6" w:space="0" w:color="000000"/>
+            </w:tcBorders>
+            <w:vAlign w:val="bottom"/>
+          </w:tcPr>
+          <w:p>
+            <w:pPr>
+              <w:pStyle w:val="Compact"/>
+              <w:widowControl/>
+              <w:spacing w:before="36" w:after="36"/>
+              <w:jc w:val="left"/>
+              <w:rPr>
+                <w:rFonts w:ascii="Cambria" w:hAnsi="Cambria" w:eastAsia="Cambria" w:cs=""/>
+                <w:kern w:val="0"/>
+                <w:sz w:val="24"/>
+                <w:szCs w:val="24"/>
+                <w:lang w:val="ru-RU" w:eastAsia="en-US" w:bidi="ar-SA"/>
+              </w:rPr>
+            </w:pPr>
+            <w:r>
+              <w:rPr>
+                <w:rFonts w:eastAsia="Cambria" w:cs=""/>
+                <w:kern w:val="0"/>
+                <w:sz w:val="24"/>
+                <w:szCs w:val="24"/>
+                <w:lang w:val="ru-RU" w:eastAsia="en-US" w:bidi="ar-SA"/>
+              </w:rPr>
+              <w:t>Как устроено</w:t>
+            </w:r>
+          </w:p>
+        </w:tc>
+      </w:tr>
+      <w:tr>
+        <w:trPr/>
+        <w:tc>
+          <w:tcPr>
+            <w:tcW w:w="4679" w:type="dxa"/>
+            <w:tcBorders/>
+          </w:tcPr>
+          <w:p>
+            <w:pPr>
+              <w:pStyle w:val="Compact"/>
+              <w:widowControl/>
+              <w:spacing w:before="36" w:after="36"/>
+              <w:jc w:val="left"/>
+              <w:rPr>
+                <w:rFonts w:ascii="Cambria" w:hAnsi="Cambria" w:eastAsia="Cambria" w:cs=""/>
+                <w:kern w:val="0"/>
+                <w:sz w:val="24"/>
+                <w:szCs w:val="24"/>
+                <w:lang w:val="ru-RU" w:eastAsia="en-US" w:bidi="ar-SA"/>
+              </w:rPr>
+            </w:pPr>
+            <w:r>
+              <w:rPr>
+                <w:rFonts w:eastAsia="Cambria" w:cs=""/>
+                <w:kern w:val="0"/>
+                <w:sz w:val="24"/>
+                <w:szCs w:val="24"/>
+                <w:lang w:val="ru-RU" w:eastAsia="en-US" w:bidi="ar-SA"/>
+              </w:rPr>
+              <w:t>Вызов</w:t>
+            </w:r>
+          </w:p>
+        </w:tc>
+        <w:tc>
+          <w:tcPr>
+            <w:tcW w:w="4680" w:type="dxa"/>
+            <w:tcBorders/>
+          </w:tcPr>
+          <w:p>
+            <w:pPr>
+              <w:pStyle w:val="Compact"/>
+              <w:widowControl/>
+              <w:spacing w:before="36" w:after="36"/>
+              <w:jc w:val="left"/>
+              <w:rPr>
+                <w:rFonts w:ascii="Cambria" w:hAnsi="Cambria" w:eastAsia="Cambria" w:cs=""/>
+                <w:kern w:val="0"/>
+                <w:sz w:val="24"/>
+                <w:szCs w:val="24"/>
+                <w:lang w:val="ru-RU" w:eastAsia="en-US" w:bidi="ar-SA"/>
+              </w:rPr>
+            </w:pPr>
+            <w:r>
+              <w:rPr>
+                <w:rFonts w:eastAsia="Cambria" w:cs=""/>
+                <w:kern w:val="0"/>
+                <w:sz w:val="24"/>
+                <w:szCs w:val="24"/>
+                <w:lang w:val="ru-RU" w:eastAsia="en-US" w:bidi="ar-SA"/>
+              </w:rPr>
+              <w:t xml:space="preserve">На кнопке </w:t>
+            </w:r>
+            <w:r>
+              <w:rPr>
+                <w:rStyle w:val="VerbatimChar"/>
+                <w:rFonts w:eastAsia="Cambria" w:cs=""/>
+                <w:kern w:val="0"/>
+                <w:szCs w:val="24"/>
+                <w:lang w:val="ru-RU" w:eastAsia="en-US" w:bidi="ar-SA"/>
+              </w:rPr>
+              <w:t>#aiTest</w:t>
+            </w:r>
+            <w:r>
+              <w:rPr>
+                <w:rFonts w:eastAsia="Cambria" w:cs=""/>
+                <w:kern w:val="0"/>
+                <w:sz w:val="24"/>
+                <w:szCs w:val="24"/>
+                <w:lang w:val="ru-RU" w:eastAsia="en-US" w:bidi="ar-SA"/>
+              </w:rPr>
+              <w:t xml:space="preserve"> два обработчика. </w:t>
+            </w:r>
+            <w:r>
+              <w:rPr>
+                <w:rStyle w:val="VerbatimChar"/>
+                <w:rFonts w:eastAsia="Cambria" w:cs=""/>
+                <w:kern w:val="0"/>
+                <w:szCs w:val="24"/>
+                <w:lang w:val="ru-RU" w:eastAsia="en-US" w:bidi="ar-SA"/>
+              </w:rPr>
+              <w:t>click</w:t>
+            </w:r>
+            <w:r>
+              <w:rPr>
+                <w:rFonts w:eastAsia="Cambria" w:cs=""/>
+                <w:kern w:val="0"/>
+                <w:sz w:val="24"/>
+                <w:szCs w:val="24"/>
+                <w:lang w:val="ru-RU" w:eastAsia="en-US" w:bidi="ar-SA"/>
+              </w:rPr>
+              <w:t xml:space="preserve"> запускает проверку подключения через </w:t>
+            </w:r>
+            <w:r>
+              <w:rPr>
+                <w:rStyle w:val="VerbatimChar"/>
+                <w:rFonts w:eastAsia="Cambria" w:cs=""/>
+                <w:kern w:val="0"/>
+                <w:szCs w:val="24"/>
+                <w:lang w:val="ru-RU" w:eastAsia="en-US" w:bidi="ar-SA"/>
+              </w:rPr>
+              <w:t>setTimeout</w:t>
+            </w:r>
+            <w:r>
+              <w:rPr>
+                <w:rFonts w:eastAsia="Cambria" w:cs=""/>
+                <w:kern w:val="0"/>
+                <w:sz w:val="24"/>
+                <w:szCs w:val="24"/>
+                <w:lang w:val="ru-RU" w:eastAsia="en-US" w:bidi="ar-SA"/>
+              </w:rPr>
+              <w:t xml:space="preserve"> 280 мс; </w:t>
+            </w:r>
+            <w:r>
+              <w:rPr>
+                <w:rStyle w:val="VerbatimChar"/>
+                <w:rFonts w:eastAsia="Cambria" w:cs=""/>
+                <w:kern w:val="0"/>
+                <w:szCs w:val="24"/>
+                <w:lang w:val="ru-RU" w:eastAsia="en-US" w:bidi="ar-SA"/>
+              </w:rPr>
+              <w:t>dblclick</w:t>
+            </w:r>
+            <w:r>
+              <w:rPr>
+                <w:rFonts w:eastAsia="Cambria" w:cs=""/>
+                <w:kern w:val="0"/>
+                <w:sz w:val="24"/>
+                <w:szCs w:val="24"/>
+                <w:lang w:val="ru-RU" w:eastAsia="en-US" w:bidi="ar-SA"/>
+              </w:rPr>
+              <w:t xml:space="preserve"> сбрасывает этот таймер (</w:t>
+            </w:r>
+            <w:r>
+              <w:rPr>
+                <w:rStyle w:val="VerbatimChar"/>
+                <w:rFonts w:eastAsia="Cambria" w:cs=""/>
+                <w:kern w:val="0"/>
+                <w:szCs w:val="24"/>
+                <w:lang w:val="ru-RU" w:eastAsia="en-US" w:bidi="ar-SA"/>
+              </w:rPr>
+              <w:t>clearTimeout</w:t>
+            </w:r>
+            <w:r>
+              <w:rPr>
+                <w:rFonts w:eastAsia="Cambria" w:cs=""/>
+                <w:kern w:val="0"/>
+                <w:sz w:val="24"/>
+                <w:szCs w:val="24"/>
+                <w:lang w:val="ru-RU" w:eastAsia="en-US" w:bidi="ar-SA"/>
+              </w:rPr>
+              <w:t>), сохраняет настройки (</w:t>
+            </w:r>
+            <w:r>
+              <w:rPr>
+                <w:rStyle w:val="VerbatimChar"/>
+                <w:rFonts w:eastAsia="Cambria" w:cs=""/>
+                <w:kern w:val="0"/>
+                <w:szCs w:val="24"/>
+                <w:lang w:val="ru-RU" w:eastAsia="en-US" w:bidi="ar-SA"/>
+              </w:rPr>
+              <w:t>saveSettings()</w:t>
+            </w:r>
+            <w:r>
+              <w:rPr>
+                <w:rFonts w:eastAsia="Cambria" w:cs=""/>
+                <w:kern w:val="0"/>
+                <w:sz w:val="24"/>
+                <w:szCs w:val="24"/>
+                <w:lang w:val="ru-RU" w:eastAsia="en-US" w:bidi="ar-SA"/>
+              </w:rPr>
+              <w:t xml:space="preserve">) и вызывает </w:t>
+            </w:r>
+            <w:r>
+              <w:rPr>
+                <w:rStyle w:val="VerbatimChar"/>
+                <w:rFonts w:eastAsia="Cambria" w:cs=""/>
+                <w:kern w:val="0"/>
+                <w:szCs w:val="24"/>
+                <w:lang w:val="ru-RU" w:eastAsia="en-US" w:bidi="ar-SA"/>
+              </w:rPr>
+              <w:t>openFreeChat()</w:t>
+            </w:r>
+            <w:r>
+              <w:rPr>
+                <w:rFonts w:eastAsia="Cambria" w:cs=""/>
+                <w:kern w:val="0"/>
+                <w:sz w:val="24"/>
+                <w:szCs w:val="24"/>
+                <w:lang w:val="ru-RU" w:eastAsia="en-US" w:bidi="ar-SA"/>
+              </w:rPr>
+              <w:t>. Так одиночный и двойной клик не конфликтуют</w:t>
+            </w:r>
+          </w:p>
+        </w:tc>
+      </w:tr>
+      <w:tr>
+        <w:trPr/>
+        <w:tc>
+          <w:tcPr>
+            <w:tcW w:w="4679" w:type="dxa"/>
+            <w:tcBorders/>
+          </w:tcPr>
+          <w:p>
+            <w:pPr>
+              <w:pStyle w:val="Compact"/>
+              <w:widowControl/>
+              <w:spacing w:before="36" w:after="36"/>
+              <w:jc w:val="left"/>
+              <w:rPr>
+                <w:rFonts w:ascii="Cambria" w:hAnsi="Cambria" w:eastAsia="Cambria" w:cs=""/>
+                <w:kern w:val="0"/>
+                <w:sz w:val="24"/>
+                <w:szCs w:val="24"/>
+                <w:lang w:val="ru-RU" w:eastAsia="en-US" w:bidi="ar-SA"/>
+              </w:rPr>
+            </w:pPr>
+            <w:r>
+              <w:rPr>
+                <w:rFonts w:eastAsia="Cambria" w:cs=""/>
+                <w:kern w:val="0"/>
+                <w:sz w:val="24"/>
+                <w:szCs w:val="24"/>
+                <w:lang w:val="ru-RU" w:eastAsia="en-US" w:bidi="ar-SA"/>
+              </w:rPr>
+              <w:t>Окно</w:t>
+            </w:r>
+          </w:p>
+        </w:tc>
+        <w:tc>
+          <w:tcPr>
+            <w:tcW w:w="4680" w:type="dxa"/>
+            <w:tcBorders/>
+          </w:tcPr>
+          <w:p>
+            <w:pPr>
+              <w:pStyle w:val="Compact"/>
+              <w:widowControl/>
+              <w:spacing w:before="36" w:after="36"/>
+              <w:jc w:val="left"/>
+              <w:rPr>
+                <w:rFonts w:ascii="Cambria" w:hAnsi="Cambria" w:eastAsia="Cambria" w:cs=""/>
+                <w:kern w:val="0"/>
+                <w:sz w:val="24"/>
+                <w:szCs w:val="24"/>
+                <w:lang w:val="ru-RU" w:eastAsia="en-US" w:bidi="ar-SA"/>
+              </w:rPr>
+            </w:pPr>
+            <w:r>
+              <w:rPr>
+                <w:rFonts w:eastAsia="Cambria" w:cs=""/>
+                <w:kern w:val="0"/>
+                <w:sz w:val="24"/>
+                <w:szCs w:val="24"/>
+                <w:lang w:val="ru-RU" w:eastAsia="en-US" w:bidi="ar-SA"/>
+              </w:rPr>
+              <w:t xml:space="preserve">Строится общим помощником </w:t>
+            </w:r>
+            <w:r>
+              <w:rPr>
+                <w:rStyle w:val="VerbatimChar"/>
+                <w:rFonts w:eastAsia="Cambria" w:cs=""/>
+                <w:kern w:val="0"/>
+                <w:szCs w:val="24"/>
+                <w:lang w:val="ru-RU" w:eastAsia="en-US" w:bidi="ar-SA"/>
+              </w:rPr>
+              <w:t>modal(html)</w:t>
+            </w:r>
+            <w:r>
+              <w:rPr>
+                <w:rFonts w:eastAsia="Cambria" w:cs=""/>
+                <w:kern w:val="0"/>
+                <w:sz w:val="24"/>
+                <w:szCs w:val="24"/>
+                <w:lang w:val="ru-RU" w:eastAsia="en-US" w:bidi="ar-SA"/>
+              </w:rPr>
+              <w:t xml:space="preserve"> (тот же, что у настроек и импорта): заголовок с именем модели, лог сообщений </w:t>
+            </w:r>
+            <w:r>
+              <w:rPr>
+                <w:rStyle w:val="VerbatimChar"/>
+                <w:rFonts w:eastAsia="Cambria" w:cs=""/>
+                <w:kern w:val="0"/>
+                <w:szCs w:val="24"/>
+                <w:lang w:val="ru-RU" w:eastAsia="en-US" w:bidi="ar-SA"/>
+              </w:rPr>
+              <w:t>#freeLog</w:t>
+            </w:r>
+            <w:r>
+              <w:rPr>
+                <w:rFonts w:eastAsia="Cambria" w:cs=""/>
+                <w:kern w:val="0"/>
+                <w:sz w:val="24"/>
+                <w:szCs w:val="24"/>
+                <w:lang w:val="ru-RU" w:eastAsia="en-US" w:bidi="ar-SA"/>
+              </w:rPr>
+              <w:t xml:space="preserve">, поле ввода </w:t>
+            </w:r>
+            <w:r>
+              <w:rPr>
+                <w:rStyle w:val="VerbatimChar"/>
+                <w:rFonts w:eastAsia="Cambria" w:cs=""/>
+                <w:kern w:val="0"/>
+                <w:szCs w:val="24"/>
+                <w:lang w:val="ru-RU" w:eastAsia="en-US" w:bidi="ar-SA"/>
+              </w:rPr>
+              <w:t>#freeText</w:t>
+            </w:r>
+            <w:r>
+              <w:rPr>
+                <w:rFonts w:eastAsia="Cambria" w:cs=""/>
+                <w:kern w:val="0"/>
+                <w:sz w:val="24"/>
+                <w:szCs w:val="24"/>
+                <w:lang w:val="ru-RU" w:eastAsia="en-US" w:bidi="ar-SA"/>
+              </w:rPr>
+              <w:t xml:space="preserve">, кнопки «Отправить», «Очистить историю», закрытие по </w:t>
+            </w:r>
+            <w:r>
+              <w:rPr>
+                <w:rStyle w:val="VerbatimChar"/>
+                <w:rFonts w:eastAsia="Cambria" w:cs=""/>
+                <w:kern w:val="0"/>
+                <w:szCs w:val="24"/>
+                <w:lang w:val="ru-RU" w:eastAsia="en-US" w:bidi="ar-SA"/>
+              </w:rPr>
+              <w:t>✕</w:t>
+            </w:r>
+            <w:r>
+              <w:rPr>
+                <w:rFonts w:eastAsia="Cambria" w:cs=""/>
+                <w:kern w:val="0"/>
+                <w:sz w:val="24"/>
+                <w:szCs w:val="24"/>
+                <w:lang w:val="ru-RU" w:eastAsia="en-US" w:bidi="ar-SA"/>
+              </w:rPr>
+              <w:t xml:space="preserve">, клику на подложку и </w:t>
+            </w:r>
+            <w:r>
+              <w:rPr>
+                <w:rStyle w:val="VerbatimChar"/>
+                <w:rFonts w:eastAsia="Cambria" w:cs=""/>
+                <w:kern w:val="0"/>
+                <w:szCs w:val="24"/>
+                <w:lang w:val="ru-RU" w:eastAsia="en-US" w:bidi="ar-SA"/>
+              </w:rPr>
+              <w:t>Esc</w:t>
+            </w:r>
+          </w:p>
+        </w:tc>
+      </w:tr>
+      <w:tr>
+        <w:trPr/>
+        <w:tc>
+          <w:tcPr>
+            <w:tcW w:w="4679" w:type="dxa"/>
+            <w:tcBorders/>
+          </w:tcPr>
+          <w:p>
+            <w:pPr>
+              <w:pStyle w:val="Compact"/>
+              <w:widowControl/>
+              <w:spacing w:before="36" w:after="36"/>
+              <w:jc w:val="left"/>
+              <w:rPr>
+                <w:rFonts w:ascii="Cambria" w:hAnsi="Cambria" w:eastAsia="Cambria" w:cs=""/>
+                <w:kern w:val="0"/>
+                <w:sz w:val="24"/>
+                <w:szCs w:val="24"/>
+                <w:lang w:val="ru-RU" w:eastAsia="en-US" w:bidi="ar-SA"/>
+              </w:rPr>
+            </w:pPr>
+            <w:r>
+              <w:rPr>
+                <w:rFonts w:eastAsia="Cambria" w:cs=""/>
+                <w:kern w:val="0"/>
+                <w:sz w:val="24"/>
+                <w:szCs w:val="24"/>
+                <w:lang w:val="ru-RU" w:eastAsia="en-US" w:bidi="ar-SA"/>
+              </w:rPr>
+              <w:t>Провайдер</w:t>
+            </w:r>
+          </w:p>
+        </w:tc>
+        <w:tc>
+          <w:tcPr>
+            <w:tcW w:w="4680" w:type="dxa"/>
+            <w:tcBorders/>
+          </w:tcPr>
+          <w:p>
+            <w:pPr>
+              <w:pStyle w:val="Compact"/>
+              <w:widowControl/>
+              <w:spacing w:before="36" w:after="36"/>
+              <w:jc w:val="left"/>
+              <w:rPr>
+                <w:rFonts w:ascii="Cambria" w:hAnsi="Cambria" w:eastAsia="Cambria" w:cs=""/>
+                <w:kern w:val="0"/>
+                <w:sz w:val="24"/>
+                <w:szCs w:val="24"/>
+                <w:lang w:val="ru-RU" w:eastAsia="en-US" w:bidi="ar-SA"/>
+              </w:rPr>
+            </w:pPr>
+            <w:r>
+              <w:rPr>
+                <w:rFonts w:eastAsia="Cambria" w:cs=""/>
+                <w:kern w:val="0"/>
+                <w:sz w:val="24"/>
+                <w:szCs w:val="24"/>
+                <w:lang w:val="ru-RU" w:eastAsia="en-US" w:bidi="ar-SA"/>
+              </w:rPr>
+              <w:t xml:space="preserve">Тот же </w:t>
+            </w:r>
+            <w:r>
+              <w:rPr>
+                <w:rStyle w:val="VerbatimChar"/>
+                <w:rFonts w:eastAsia="Cambria" w:cs=""/>
+                <w:kern w:val="0"/>
+                <w:szCs w:val="24"/>
+                <w:lang w:val="ru-RU" w:eastAsia="en-US" w:bidi="ar-SA"/>
+              </w:rPr>
+              <w:t>chat()</w:t>
+            </w:r>
+            <w:r>
+              <w:rPr>
+                <w:rFonts w:eastAsia="Cambria" w:cs=""/>
+                <w:kern w:val="0"/>
+                <w:sz w:val="24"/>
+                <w:szCs w:val="24"/>
+                <w:lang w:val="ru-RU" w:eastAsia="en-US" w:bidi="ar-SA"/>
+              </w:rPr>
+              <w:t xml:space="preserve"> из </w:t>
+            </w:r>
+            <w:r>
+              <w:rPr>
+                <w:rStyle w:val="VerbatimChar"/>
+                <w:rFonts w:eastAsia="Cambria" w:cs=""/>
+                <w:kern w:val="0"/>
+                <w:szCs w:val="24"/>
+                <w:lang w:val="ru-RU" w:eastAsia="en-US" w:bidi="ar-SA"/>
+              </w:rPr>
+              <w:t>src/ai/providers.js</w:t>
+            </w:r>
+            <w:r>
+              <w:rPr>
+                <w:rFonts w:eastAsia="Cambria" w:cs=""/>
+                <w:kern w:val="0"/>
+                <w:sz w:val="24"/>
+                <w:szCs w:val="24"/>
+                <w:lang w:val="ru-RU" w:eastAsia="en-US" w:bidi="ar-SA"/>
+              </w:rPr>
+              <w:t xml:space="preserve"> и те же </w:t>
+            </w:r>
+            <w:r>
+              <w:rPr>
+                <w:rStyle w:val="VerbatimChar"/>
+                <w:rFonts w:eastAsia="Cambria" w:cs=""/>
+                <w:kern w:val="0"/>
+                <w:szCs w:val="24"/>
+                <w:lang w:val="ru-RU" w:eastAsia="en-US" w:bidi="ar-SA"/>
+              </w:rPr>
+              <w:t>state.ai.settings</w:t>
+            </w:r>
+            <w:r>
+              <w:rPr>
+                <w:rFonts w:eastAsia="Cambria" w:cs=""/>
+                <w:kern w:val="0"/>
+                <w:sz w:val="24"/>
+                <w:szCs w:val="24"/>
+                <w:lang w:val="ru-RU" w:eastAsia="en-US" w:bidi="ar-SA"/>
+              </w:rPr>
+              <w:t>, что у ассистента: смена провайдера, ключа или модели в настройках действует и на скрытый чат</w:t>
+            </w:r>
+          </w:p>
+        </w:tc>
+      </w:tr>
+      <w:tr>
+        <w:trPr/>
+        <w:tc>
+          <w:tcPr>
+            <w:tcW w:w="4679" w:type="dxa"/>
+            <w:tcBorders/>
+          </w:tcPr>
+          <w:p>
+            <w:pPr>
+              <w:pStyle w:val="Compact"/>
+              <w:widowControl/>
+              <w:spacing w:before="36" w:after="36"/>
+              <w:jc w:val="left"/>
+              <w:rPr>
+                <w:rFonts w:ascii="Cambria" w:hAnsi="Cambria" w:eastAsia="Cambria" w:cs=""/>
+                <w:kern w:val="0"/>
+                <w:sz w:val="24"/>
+                <w:szCs w:val="24"/>
+                <w:lang w:val="ru-RU" w:eastAsia="en-US" w:bidi="ar-SA"/>
+              </w:rPr>
+            </w:pPr>
+            <w:r>
+              <w:rPr>
+                <w:rFonts w:eastAsia="Cambria" w:cs=""/>
+                <w:kern w:val="0"/>
+                <w:sz w:val="24"/>
+                <w:szCs w:val="24"/>
+                <w:lang w:val="ru-RU" w:eastAsia="en-US" w:bidi="ar-SA"/>
+              </w:rPr>
+              <w:t>Контекст</w:t>
+            </w:r>
+          </w:p>
+        </w:tc>
+        <w:tc>
+          <w:tcPr>
+            <w:tcW w:w="4680" w:type="dxa"/>
+            <w:tcBorders/>
+          </w:tcPr>
+          <w:p>
+            <w:pPr>
+              <w:pStyle w:val="Compact"/>
+              <w:widowControl/>
+              <w:spacing w:before="36" w:after="36"/>
+              <w:jc w:val="left"/>
+              <w:rPr>
+                <w:rFonts w:ascii="Cambria" w:hAnsi="Cambria" w:eastAsia="Cambria" w:cs=""/>
+                <w:kern w:val="0"/>
+                <w:sz w:val="24"/>
+                <w:szCs w:val="24"/>
+                <w:lang w:val="ru-RU" w:eastAsia="en-US" w:bidi="ar-SA"/>
+              </w:rPr>
+            </w:pPr>
+            <w:r>
+              <w:rPr>
+                <w:rFonts w:eastAsia="Cambria" w:cs=""/>
+                <w:kern w:val="0"/>
+                <w:sz w:val="24"/>
+                <w:szCs w:val="24"/>
+                <w:lang w:val="ru-RU" w:eastAsia="en-US" w:bidi="ar-SA"/>
+              </w:rPr>
+              <w:t xml:space="preserve">Финансовая модель в запрос </w:t>
+            </w:r>
+            <w:r>
+              <w:rPr>
+                <w:rFonts w:eastAsia="Cambria" w:cs=""/>
+                <w:b/>
+                <w:bCs/>
+                <w:kern w:val="0"/>
+                <w:sz w:val="24"/>
+                <w:szCs w:val="24"/>
+                <w:lang w:val="ru-RU" w:eastAsia="en-US" w:bidi="ar-SA"/>
+              </w:rPr>
+              <w:t>не передаётся</w:t>
+            </w:r>
+            <w:r>
+              <w:rPr>
+                <w:rFonts w:eastAsia="Cambria" w:cs=""/>
+                <w:kern w:val="0"/>
+                <w:sz w:val="24"/>
+                <w:szCs w:val="24"/>
+                <w:lang w:val="ru-RU" w:eastAsia="en-US" w:bidi="ar-SA"/>
+              </w:rPr>
+              <w:t>. Системный промпт фиксированный: «Ты — полезный ассистент. Отвечай по-русски, кратко и по делу. Используй markdown». В историю уходят последние 20 сообщений</w:t>
+            </w:r>
+          </w:p>
+        </w:tc>
+      </w:tr>
+      <w:tr>
+        <w:trPr/>
+        <w:tc>
+          <w:tcPr>
+            <w:tcW w:w="4679" w:type="dxa"/>
+            <w:tcBorders/>
+          </w:tcPr>
+          <w:p>
+            <w:pPr>
+              <w:pStyle w:val="Compact"/>
+              <w:widowControl/>
+              <w:spacing w:before="36" w:after="36"/>
+              <w:jc w:val="left"/>
+              <w:rPr>
+                <w:rFonts w:ascii="Cambria" w:hAnsi="Cambria" w:eastAsia="Cambria" w:cs=""/>
+                <w:kern w:val="0"/>
+                <w:sz w:val="24"/>
+                <w:szCs w:val="24"/>
+                <w:lang w:val="ru-RU" w:eastAsia="en-US" w:bidi="ar-SA"/>
+              </w:rPr>
+            </w:pPr>
+            <w:r>
+              <w:rPr>
+                <w:rFonts w:eastAsia="Cambria" w:cs=""/>
+                <w:kern w:val="0"/>
+                <w:sz w:val="24"/>
+                <w:szCs w:val="24"/>
+                <w:lang w:val="ru-RU" w:eastAsia="en-US" w:bidi="ar-SA"/>
+              </w:rPr>
+              <w:t>История</w:t>
+            </w:r>
+          </w:p>
+        </w:tc>
+        <w:tc>
+          <w:tcPr>
+            <w:tcW w:w="4680" w:type="dxa"/>
+            <w:tcBorders/>
+          </w:tcPr>
+          <w:p>
+            <w:pPr>
+              <w:pStyle w:val="Compact"/>
+              <w:widowControl/>
+              <w:spacing w:before="36" w:after="36"/>
+              <w:jc w:val="left"/>
+              <w:rPr>
+                <w:rFonts w:ascii="Cambria" w:hAnsi="Cambria" w:eastAsia="Cambria" w:cs=""/>
+                <w:kern w:val="0"/>
+                <w:sz w:val="24"/>
+                <w:szCs w:val="24"/>
+                <w:lang w:val="ru-RU" w:eastAsia="en-US" w:bidi="ar-SA"/>
+              </w:rPr>
+            </w:pPr>
+            <w:r>
+              <w:rPr>
+                <w:rStyle w:val="VerbatimChar"/>
+                <w:rFonts w:eastAsia="Cambria" w:cs=""/>
+                <w:kern w:val="0"/>
+                <w:szCs w:val="24"/>
+                <w:lang w:val="ru-RU" w:eastAsia="en-US" w:bidi="ar-SA"/>
+              </w:rPr>
+              <w:t>state.ai.freeHistory</w:t>
+            </w:r>
+            <w:r>
+              <w:rPr>
+                <w:rFonts w:eastAsia="Cambria" w:cs=""/>
+                <w:kern w:val="0"/>
+                <w:sz w:val="24"/>
+                <w:szCs w:val="24"/>
+                <w:lang w:val="ru-RU" w:eastAsia="en-US" w:bidi="ar-SA"/>
+              </w:rPr>
+              <w:t xml:space="preserve"> — отдельный массив, не пересекается с </w:t>
+            </w:r>
+            <w:r>
+              <w:rPr>
+                <w:rStyle w:val="VerbatimChar"/>
+                <w:rFonts w:eastAsia="Cambria" w:cs=""/>
+                <w:kern w:val="0"/>
+                <w:szCs w:val="24"/>
+                <w:lang w:val="ru-RU" w:eastAsia="en-US" w:bidi="ar-SA"/>
+              </w:rPr>
+              <w:t>state.ai.history</w:t>
+            </w:r>
+            <w:r>
+              <w:rPr>
+                <w:rFonts w:eastAsia="Cambria" w:cs=""/>
+                <w:kern w:val="0"/>
+                <w:sz w:val="24"/>
+                <w:szCs w:val="24"/>
+                <w:lang w:val="ru-RU" w:eastAsia="en-US" w:bidi="ar-SA"/>
+              </w:rPr>
+              <w:t xml:space="preserve"> основного чата, в localStorage и в JSON модели не сохраняется, живёт до перезагрузки вкладки; при повторном открытии окна восстанавливается</w:t>
+            </w:r>
+          </w:p>
+        </w:tc>
+      </w:tr>
+      <w:tr>
+        <w:trPr/>
+        <w:tc>
+          <w:tcPr>
+            <w:tcW w:w="4679" w:type="dxa"/>
+            <w:tcBorders/>
+          </w:tcPr>
+          <w:p>
+            <w:pPr>
+              <w:pStyle w:val="Compact"/>
+              <w:widowControl/>
+              <w:spacing w:before="36" w:after="36"/>
+              <w:jc w:val="left"/>
+              <w:rPr>
+                <w:rFonts w:ascii="Cambria" w:hAnsi="Cambria" w:eastAsia="Cambria" w:cs=""/>
+                <w:kern w:val="0"/>
+                <w:sz w:val="24"/>
+                <w:szCs w:val="24"/>
+                <w:lang w:val="ru-RU" w:eastAsia="en-US" w:bidi="ar-SA"/>
+              </w:rPr>
+            </w:pPr>
+            <w:r>
+              <w:rPr>
+                <w:rFonts w:eastAsia="Cambria" w:cs=""/>
+                <w:kern w:val="0"/>
+                <w:sz w:val="24"/>
+                <w:szCs w:val="24"/>
+                <w:lang w:val="ru-RU" w:eastAsia="en-US" w:bidi="ar-SA"/>
+              </w:rPr>
+              <w:t>Ввод</w:t>
+            </w:r>
+          </w:p>
+        </w:tc>
+        <w:tc>
+          <w:tcPr>
+            <w:tcW w:w="4680" w:type="dxa"/>
+            <w:tcBorders/>
+          </w:tcPr>
+          <w:p>
+            <w:pPr>
+              <w:pStyle w:val="Compact"/>
+              <w:widowControl/>
+              <w:spacing w:before="36" w:after="36"/>
+              <w:jc w:val="left"/>
+              <w:rPr>
+                <w:rFonts w:ascii="Cambria" w:hAnsi="Cambria" w:eastAsia="Cambria" w:cs=""/>
+                <w:kern w:val="0"/>
+                <w:sz w:val="24"/>
+                <w:szCs w:val="24"/>
+                <w:lang w:val="ru-RU" w:eastAsia="en-US" w:bidi="ar-SA"/>
+              </w:rPr>
+            </w:pPr>
+            <w:r>
+              <w:rPr>
+                <w:rStyle w:val="VerbatimChar"/>
+                <w:rFonts w:eastAsia="Cambria" w:cs=""/>
+                <w:kern w:val="0"/>
+                <w:szCs w:val="24"/>
+                <w:lang w:val="ru-RU" w:eastAsia="en-US" w:bidi="ar-SA"/>
+              </w:rPr>
+              <w:t>Ctrl+Enter</w:t>
+            </w:r>
+            <w:r>
+              <w:rPr>
+                <w:rFonts w:eastAsia="Cambria" w:cs=""/>
+                <w:kern w:val="0"/>
+                <w:sz w:val="24"/>
+                <w:szCs w:val="24"/>
+                <w:lang w:val="ru-RU" w:eastAsia="en-US" w:bidi="ar-SA"/>
+              </w:rPr>
+              <w:t xml:space="preserve"> / </w:t>
+            </w:r>
+            <w:r>
+              <w:rPr>
+                <w:rStyle w:val="VerbatimChar"/>
+                <w:rFonts w:eastAsia="Cambria" w:cs=""/>
+                <w:kern w:val="0"/>
+                <w:szCs w:val="24"/>
+                <w:lang w:val="ru-RU" w:eastAsia="en-US" w:bidi="ar-SA"/>
+              </w:rPr>
+              <w:t>Cmd+Enter</w:t>
+            </w:r>
+            <w:r>
+              <w:rPr>
+                <w:rFonts w:eastAsia="Cambria" w:cs=""/>
+                <w:kern w:val="0"/>
+                <w:sz w:val="24"/>
+                <w:szCs w:val="24"/>
+                <w:lang w:val="ru-RU" w:eastAsia="en-US" w:bidi="ar-SA"/>
+              </w:rPr>
+              <w:t xml:space="preserve"> отправляет, во время запроса кнопка блокируется и показывает индикатор; ответ рендерится через </w:t>
+            </w:r>
+            <w:r>
+              <w:rPr>
+                <w:rStyle w:val="VerbatimChar"/>
+                <w:rFonts w:eastAsia="Cambria" w:cs=""/>
+                <w:kern w:val="0"/>
+                <w:szCs w:val="24"/>
+                <w:lang w:val="ru-RU" w:eastAsia="en-US" w:bidi="ar-SA"/>
+              </w:rPr>
+              <w:t>mdToHtml</w:t>
+            </w:r>
+            <w:r>
+              <w:rPr>
+                <w:rFonts w:eastAsia="Cambria" w:cs=""/>
+                <w:kern w:val="0"/>
+                <w:sz w:val="24"/>
+                <w:szCs w:val="24"/>
+                <w:lang w:val="ru-RU" w:eastAsia="en-US" w:bidi="ar-SA"/>
+              </w:rPr>
+              <w:t>, ошибки запроса показываются системным сообщением в логе</w:t>
+            </w:r>
+          </w:p>
+        </w:tc>
+      </w:tr>
+      <w:tr>
+        <w:trPr/>
+        <w:tc>
+          <w:tcPr>
+            <w:tcW w:w="4679" w:type="dxa"/>
+            <w:tcBorders/>
+          </w:tcPr>
+          <w:p>
+            <w:pPr>
+              <w:pStyle w:val="Compact"/>
+              <w:widowControl/>
+              <w:spacing w:before="36" w:after="36"/>
+              <w:jc w:val="left"/>
+              <w:rPr>
+                <w:rFonts w:ascii="Cambria" w:hAnsi="Cambria" w:eastAsia="Cambria" w:cs=""/>
+                <w:kern w:val="0"/>
+                <w:sz w:val="24"/>
+                <w:szCs w:val="24"/>
+                <w:lang w:val="ru-RU" w:eastAsia="en-US" w:bidi="ar-SA"/>
+              </w:rPr>
+            </w:pPr>
+            <w:r>
+              <w:rPr>
+                <w:rFonts w:eastAsia="Cambria" w:cs=""/>
+                <w:kern w:val="0"/>
+                <w:sz w:val="24"/>
+                <w:szCs w:val="24"/>
+                <w:lang w:val="ru-RU" w:eastAsia="en-US" w:bidi="ar-SA"/>
+              </w:rPr>
+              <w:t>Назначение</w:t>
+            </w:r>
+          </w:p>
+        </w:tc>
+        <w:tc>
+          <w:tcPr>
+            <w:tcW w:w="4680" w:type="dxa"/>
+            <w:tcBorders/>
+          </w:tcPr>
+          <w:p>
+            <w:pPr>
+              <w:pStyle w:val="Compact"/>
+              <w:widowControl/>
+              <w:spacing w:before="36" w:after="36"/>
+              <w:jc w:val="left"/>
+              <w:rPr>
+                <w:rFonts w:ascii="Cambria" w:hAnsi="Cambria" w:eastAsia="Cambria" w:cs=""/>
+                <w:kern w:val="0"/>
+                <w:sz w:val="24"/>
+                <w:szCs w:val="24"/>
+                <w:lang w:val="ru-RU" w:eastAsia="en-US" w:bidi="ar-SA"/>
+              </w:rPr>
+            </w:pPr>
+            <w:r>
+              <w:rPr>
+                <w:rFonts w:eastAsia="Cambria" w:cs=""/>
+                <w:kern w:val="0"/>
+                <w:sz w:val="24"/>
+                <w:szCs w:val="24"/>
+                <w:lang w:val="ru-RU" w:eastAsia="en-US" w:bidi="ar-SA"/>
+              </w:rPr>
+              <w:t>Быстрая проверка качества и доступности подключённой модели «вне контекста», черновые вопросы по методике, сравнение моделей после смены настроек</w:t>
+            </w:r>
+          </w:p>
+        </w:tc>
+      </w:tr>
+    </w:tbl>
+    <w:p>
+      <w:pPr>
+        <w:pStyle w:val="BodyText"/>
+        <w:rPr/>
+      </w:pPr>
+      <w:r>
+        <w:rPr/>
+        <w:t xml:space="preserve">Проверка: сценарий </w:t>
+      </w:r>
+      <w:r>
+        <w:rPr>
+          <w:rStyle w:val="VerbatimChar"/>
+        </w:rPr>
+        <w:t>scratchpad/freechat.mjs</w:t>
+      </w:r>
+      <w:r>
+        <w:rPr/>
+        <w:t xml:space="preserve"> в сеансе разработки (двойной клик → ответ → Esc → повторное открытие с историей → одиночный клик по-прежнему выполняет проверку) пройден локально и на опубликованном сайте.</w:t>
+      </w:r>
+    </w:p>
+    <w:p>
+      <w:pPr>
+        <w:pStyle w:val="Normal"/>
+        <w:rPr/>
+      </w:pPr>
+      <w:bookmarkStart w:id="43" w:name="ии-ассистент-srcai"/>
+      <w:bookmarkStart w:id="44" w:name="скрытый-режим-свободный-чат-с-моделью"/>
+      <w:r>
+        <w:rPr/>
+        <mc:AlternateContent>
+          <mc:Choice Requires="wps">
+            <w:drawing>
+              <wp:inline distT="0" distB="0" distL="0" distR="0">
+                <wp:extent cx="5943600" cy="19050"/>
+                <wp:effectExtent l="0" t="0" r="0" b="0"/>
+                <wp:docPr id="28" name=""/>
+                <a:graphic xmlns:a="http://schemas.openxmlformats.org/drawingml/2006/main">
+                  <a:graphicData uri="http://schemas.microsoft.com/office/word/2010/wordprocessingShape">
+                    <wps:wsp>
+                      <wps:cNvSpPr/>
+                      <wps:nvSpPr>
+                        <wps:cNvPr id="29" name=""/>
+                        <wps:cNvSpPr/>
+                      </wps:nvSpPr>
+                      <wps:spPr>
+                        <a:xfrm>
+                          <a:off x="0" y="0"/>
+                          <a:ext cx="5943600" cy="19080"/>
+                        </a:xfrm>
+                        <a:prstGeom prst="rect">
+                          <a:avLst/>
+                        </a:prstGeom>
+                        <a:solidFill>
+                          <a:srgbClr val="ffffff"/>
+                        </a:solidFill>
+                        <a:ln w="0">
+                          <a:solidFill>
+                            <a:srgbClr val="000000"/>
+                          </a:solidFill>
+                        </a:ln>
+                      </wps:spPr>
+                      <wps:bodyPr/>
+                    </wps:wsp>
+                  </a:graphicData>
+                </a:graphic>
+                <wp14:sizeRelH relativeFrom="page">
+                  <wp14:pctWidth>100000</wp14:pctWidth>
+                </wp14:sizeRelH>
+              </wp:inline>
+            </w:drawing>
+          </mc:Choice>
+          <mc:Fallback>
+            <w:pict>
+              <v:rect id="shape_0" fillcolor="white" stroked="t" o:allowincell="f" style="position:absolute;margin-left:0pt;margin-top:-1.55pt;width:467.95pt;height:1.45pt;mso-wrap-style:none;v-text-anchor:middle;mso-position-horizontal:center;mso-position-vertical:top">
+                <v:fill o:detectmouseclick="t" type="solid" color2="black"/>
+                <v:stroke color="black" joinstyle="round" endcap="flat"/>
+                <w10:wrap type="topAndBottom"/>
+              </v:rect>
+            </w:pict>
+          </mc:Fallback>
+        </mc:AlternateContent>
+      </w:r>
+      <w:bookmarkEnd w:id="43"/>
+      <w:bookmarkEnd w:id="44"/>
+    </w:p>
+    <w:p>
+      <w:pPr>
         <w:pStyle w:val="Heading2"/>
         <w:rPr/>
       </w:pPr>
-      <w:bookmarkStart w:id="43" w:name="инфраструктура-и-скрипты"/>
+      <w:bookmarkStart w:id="45" w:name="инфраструктура-и-скрипты"/>
       <w:r>
         <w:rPr/>
         <w:t>10. Инфраструктура и скрипты</w:t>
@@ -17265,7 +18446,7 @@
           <wp:inline distT="0" distB="0" distL="0" distR="0">
             <wp:extent cx="4356100" cy="7217410"/>
             <wp:effectExtent l="0" t="0" r="0" b="0"/>
-            <wp:docPr id="28" name="Image8" descr="Деплой"/>
+            <wp:docPr id="30" name="Image8" descr="Деплой"/>
             <wp:cNvGraphicFramePr>
               <a:graphicFrameLocks xmlns:a="http://schemas.openxmlformats.org/drawingml/2006/main" noChangeAspect="1"/>
             </wp:cNvGraphicFramePr>
@@ -17273,7 +18454,7 @@
               <a:graphicData uri="http://schemas.openxmlformats.org/drawingml/2006/picture">
                 <pic:pic xmlns:pic="http://schemas.openxmlformats.org/drawingml/2006/picture">
                   <pic:nvPicPr>
-                    <pic:cNvPr id="28" name="Image8" descr="Деплой"/>
+                    <pic:cNvPr id="30" name="Image8" descr="Деплой"/>
                     <pic:cNvPicPr>
                       <a:picLocks noChangeAspect="1" noChangeArrowheads="1"/>
                     </pic:cNvPicPr>
@@ -18311,7 +19492,7 @@
         <w:pStyle w:val="Normal"/>
         <w:rPr/>
       </w:pPr>
-      <w:bookmarkStart w:id="44" w:name="инфраструктура-и-скрипты"/>
+      <w:bookmarkStart w:id="46" w:name="инфраструктура-и-скрипты"/>
       <w:r>
         <w:rPr/>
         <mc:AlternateContent>
@@ -18320,13 +19501,13 @@
               <wp:inline distT="0" distB="0" distL="0" distR="0">
                 <wp:extent cx="635" cy="19050"/>
                 <wp:effectExtent l="0" t="0" r="0" b="0"/>
-                <wp:docPr id="29" name=""/>
+                <wp:docPr id="31" name=""/>
                 <a:graphic xmlns:a="http://schemas.openxmlformats.org/drawingml/2006/main">
                   <a:graphicData uri="http://schemas.microsoft.com/office/word/2010/wordprocessingShape">
                     <wps:wsp>
                       <wps:cNvSpPr/>
                       <wps:nvSpPr>
-                        <wps:cNvPr id="30" name=""/>
+                        <wps:cNvPr id="32" name=""/>
                         <wps:cNvSpPr/>
                       </wps:nvSpPr>
                       <wps:spPr>
@@ -18367,14 +19548,14 @@
           </mc:Fallback>
         </mc:AlternateContent>
       </w:r>
-      <w:bookmarkEnd w:id="44"/>
+      <w:bookmarkEnd w:id="46"/>
     </w:p>
     <w:p>
       <w:pPr>
         <w:pStyle w:val="Heading2"/>
         <w:rPr/>
       </w:pPr>
-      <w:bookmarkStart w:id="45" w:name="тестирование"/>
+      <w:bookmarkStart w:id="47" w:name="тестирование"/>
       <w:r>
         <w:rPr/>
         <w:t>11. Тестирование</w:t>
@@ -18995,316 +20176,7 @@
         <w:pStyle w:val="Normal"/>
         <w:rPr/>
       </w:pPr>
-      <w:bookmarkStart w:id="46" w:name="тестирование"/>
-      <w:r>
-        <w:rPr/>
-        <mc:AlternateContent>
-          <mc:Choice Requires="wps">
-            <w:drawing>
-              <wp:inline distT="0" distB="0" distL="0" distR="0">
-                <wp:extent cx="5943600" cy="19050"/>
-                <wp:effectExtent l="0" t="0" r="0" b="0"/>
-                <wp:docPr id="31" name=""/>
-                <a:graphic xmlns:a="http://schemas.openxmlformats.org/drawingml/2006/main">
-                  <a:graphicData uri="http://schemas.microsoft.com/office/word/2010/wordprocessingShape">
-                    <wps:wsp>
-                      <wps:cNvSpPr/>
-                      <wps:nvSpPr>
-                        <wps:cNvPr id="32" name=""/>
-                        <wps:cNvSpPr/>
-                      </wps:nvSpPr>
-                      <wps:spPr>
-                        <a:xfrm>
-                          <a:off x="0" y="0"/>
-                          <a:ext cx="5943600" cy="19080"/>
-                        </a:xfrm>
-                        <a:prstGeom prst="rect">
-                          <a:avLst/>
-                        </a:prstGeom>
-                        <a:solidFill>
-                          <a:srgbClr val="ffffff"/>
-                        </a:solidFill>
-                        <a:ln w="0">
-                          <a:solidFill>
-                            <a:srgbClr val="000000"/>
-                          </a:solidFill>
-                        </a:ln>
-                      </wps:spPr>
-                      <wps:bodyPr/>
-                    </wps:wsp>
-                  </a:graphicData>
-                </a:graphic>
-                <wp14:sizeRelH relativeFrom="page">
-                  <wp14:pctWidth>100000</wp14:pctWidth>
-                </wp14:sizeRelH>
-              </wp:inline>
-            </w:drawing>
-          </mc:Choice>
-          <mc:Fallback>
-            <w:pict>
-              <v:rect id="shape_0" fillcolor="white" stroked="t" o:allowincell="f" style="position:absolute;margin-left:0pt;margin-top:-1.55pt;width:467.95pt;height:1.45pt;mso-wrap-style:none;v-text-anchor:middle;mso-position-horizontal:center;mso-position-vertical:top">
-                <v:fill o:detectmouseclick="t" type="solid" color2="black"/>
-                <v:stroke color="black" joinstyle="round" endcap="flat"/>
-                <w10:wrap type="topAndBottom"/>
-              </v:rect>
-            </w:pict>
-          </mc:Fallback>
-        </mc:AlternateContent>
-      </w:r>
-      <w:bookmarkEnd w:id="46"/>
-    </w:p>
-    <w:p>
-      <w:pPr>
-        <w:pStyle w:val="Heading2"/>
-        <w:rPr/>
-      </w:pPr>
-      <w:bookmarkStart w:id="47" w:name="развёртывание-и-эксплуатация"/>
-      <w:r>
-        <w:rPr/>
-        <w:t>12. Развёртывание и эксплуатация</w:t>
-      </w:r>
-    </w:p>
-    <w:p>
-      <w:pPr>
-        <w:pStyle w:val="FirstParagraph"/>
-        <w:rPr/>
-      </w:pPr>
-      <w:r>
-        <w:rPr>
-          <w:b/>
-          <w:bCs/>
-        </w:rPr>
-        <w:t>GitHub Pages.</w:t>
-      </w:r>
-      <w:r>
-        <w:rPr/>
-        <w:t xml:space="preserve"> Settings → Pages → Source: GitHub Actions; затем любой push в </w:t>
-      </w:r>
-      <w:r>
-        <w:rPr>
-          <w:rStyle w:val="VerbatimChar"/>
-        </w:rPr>
-        <w:t>main</w:t>
-      </w:r>
-      <w:r>
-        <w:rPr/>
-        <w:t xml:space="preserve">. Адрес </w:t>
-      </w:r>
-      <w:r>
-        <w:rPr>
-          <w:rStyle w:val="VerbatimChar"/>
-        </w:rPr>
-        <w:t>https://&lt;логин&gt;.github.io/invest-project-eval/</w:t>
-      </w:r>
-      <w:r>
-        <w:rPr/>
-        <w:t>.</w:t>
-      </w:r>
-    </w:p>
-    <w:p>
-      <w:pPr>
-        <w:pStyle w:val="BodyText"/>
-        <w:rPr/>
-      </w:pPr>
-      <w:r>
-        <w:rPr>
-          <w:b/>
-          <w:bCs/>
-        </w:rPr>
-        <w:t>Cloudflare Pages.</w:t>
-      </w:r>
-      <w:r>
-        <w:rPr/>
-        <w:t xml:space="preserve"> Подключить репозиторий, preset None, build command пустой, output </w:t>
-      </w:r>
-      <w:r>
-        <w:rPr>
-          <w:rStyle w:val="VerbatimChar"/>
-        </w:rPr>
-        <w:t>/</w:t>
-      </w:r>
-      <w:r>
-        <w:rPr/>
-        <w:t>.</w:t>
-      </w:r>
-    </w:p>
-    <w:p>
-      <w:pPr>
-        <w:pStyle w:val="BodyText"/>
-        <w:rPr/>
-      </w:pPr>
-      <w:r>
-        <w:rPr>
-          <w:b/>
-          <w:bCs/>
-        </w:rPr>
-        <w:t>Tilda / любой сайт.</w:t>
-      </w:r>
-      <w:r>
-        <w:rPr/>
-        <w:t xml:space="preserve"> Блок HTML с </w:t>
-      </w:r>
-      <w:r>
-        <w:rPr>
-          <w:rStyle w:val="VerbatimChar"/>
-        </w:rPr>
-        <w:t>&lt;iframe src="…/#/t/express?sample=cafe"&gt;</w:t>
-      </w:r>
-      <w:r>
-        <w:rPr/>
-        <w:t xml:space="preserve">. Ссылки на конкретный шаблон и пример: </w:t>
-      </w:r>
-      <w:r>
-        <w:rPr>
-          <w:rStyle w:val="VerbatimChar"/>
-        </w:rPr>
-        <w:t>#/t/&lt;id&gt;?sample=&lt;sampleId&gt;&amp;level=&lt;express|basic|pro&gt;&amp;tab=&lt;inputs|results|…&gt;</w:t>
-      </w:r>
-      <w:r>
-        <w:rPr/>
-        <w:t>.</w:t>
-      </w:r>
-    </w:p>
-    <w:p>
-      <w:pPr>
-        <w:pStyle w:val="BodyText"/>
-        <w:rPr/>
-      </w:pPr>
-      <w:r>
-        <w:rPr>
-          <w:b/>
-          <w:bCs/>
-        </w:rPr>
-        <w:t>Смена модели ИИ по умолчанию.</w:t>
-      </w:r>
-      <w:r>
-        <w:rPr/>
-        <w:t xml:space="preserve"> Variables </w:t>
-      </w:r>
-      <w:r>
-        <w:rPr>
-          <w:rStyle w:val="VerbatimChar"/>
-        </w:rPr>
-        <w:t>AI_PROVIDER</w:t>
-      </w:r>
-      <w:r>
-        <w:rPr/>
-        <w:t xml:space="preserve">, </w:t>
-      </w:r>
-      <w:r>
-        <w:rPr>
-          <w:rStyle w:val="VerbatimChar"/>
-        </w:rPr>
-        <w:t>AI_BASE_URL</w:t>
-      </w:r>
-      <w:r>
-        <w:rPr/>
-        <w:t xml:space="preserve">, </w:t>
-      </w:r>
-      <w:r>
-        <w:rPr>
-          <w:rStyle w:val="VerbatimChar"/>
-        </w:rPr>
-        <w:t>AI_MODEL</w:t>
-      </w:r>
-      <w:r>
-        <w:rPr/>
-        <w:t xml:space="preserve">, </w:t>
-      </w:r>
-      <w:r>
-        <w:rPr>
-          <w:rStyle w:val="VerbatimChar"/>
-        </w:rPr>
-        <w:t>AI_LABEL</w:t>
-      </w:r>
-      <w:r>
-        <w:rPr/>
-        <w:t xml:space="preserve">, Secret </w:t>
-      </w:r>
-      <w:r>
-        <w:rPr>
-          <w:rStyle w:val="VerbatimChar"/>
-        </w:rPr>
-        <w:t>AI_API_KEY</w:t>
-      </w:r>
-      <w:r>
-        <w:rPr/>
-        <w:t xml:space="preserve"> в Settings → Secrets and variables → Actions; затем push или Re-run workflow. Для боевого ключа — Worker (</w:t>
-      </w:r>
-      <w:r>
-        <w:rPr>
-          <w:rStyle w:val="VerbatimChar"/>
-        </w:rPr>
-        <w:t>wrangler secret put PROVIDER_KEY</w:t>
-      </w:r>
-      <w:r>
-        <w:rPr/>
-        <w:t xml:space="preserve">, </w:t>
-      </w:r>
-      <w:r>
-        <w:rPr>
-          <w:rStyle w:val="VerbatimChar"/>
-        </w:rPr>
-        <w:t>wrangler deploy</w:t>
-      </w:r>
-      <w:r>
-        <w:rPr/>
-        <w:t xml:space="preserve">) и </w:t>
-      </w:r>
-      <w:r>
-        <w:rPr>
-          <w:rStyle w:val="VerbatimChar"/>
-        </w:rPr>
-        <w:t>AI_PROVIDER=webhook</w:t>
-      </w:r>
-      <w:r>
-        <w:rPr/>
-        <w:t>.</w:t>
-      </w:r>
-    </w:p>
-    <w:p>
-      <w:pPr>
-        <w:pStyle w:val="BodyText"/>
-        <w:rPr/>
-      </w:pPr>
-      <w:r>
-        <w:rPr>
-          <w:b/>
-          <w:bCs/>
-        </w:rPr>
-        <w:t>Локальная разработка.</w:t>
-      </w:r>
-      <w:r>
-        <w:rPr/>
-        <w:t xml:space="preserve"> </w:t>
-      </w:r>
-      <w:r>
-        <w:rPr>
-          <w:rStyle w:val="VerbatimChar"/>
-        </w:rPr>
-        <w:t>npx serve .</w:t>
-      </w:r>
-      <w:r>
-        <w:rPr/>
-        <w:t xml:space="preserve"> (или любой статический сервер), ES-модули требуют http(s), не </w:t>
-      </w:r>
-      <w:r>
-        <w:rPr>
-          <w:rStyle w:val="VerbatimChar"/>
-        </w:rPr>
-        <w:t>file://</w:t>
-      </w:r>
-      <w:r>
-        <w:rPr/>
-        <w:t>.</w:t>
-      </w:r>
-    </w:p>
-    <w:p>
-      <w:pPr>
-        <w:pStyle w:val="Normal"/>
-        <w:rPr/>
-      </w:pPr>
-      <w:bookmarkStart w:id="48" w:name="развёртывание-и-эксплуатация"/>
+      <w:bookmarkStart w:id="48" w:name="тестирование"/>
       <w:r>
         <w:rPr/>
         <mc:AlternateContent>
@@ -19367,7 +20239,316 @@
         <w:pStyle w:val="Heading2"/>
         <w:rPr/>
       </w:pPr>
-      <w:bookmarkStart w:id="49" w:name="ограничения-и-возможные-доработки"/>
+      <w:bookmarkStart w:id="49" w:name="развёртывание-и-эксплуатация"/>
+      <w:r>
+        <w:rPr/>
+        <w:t>12. Развёртывание и эксплуатация</w:t>
+      </w:r>
+    </w:p>
+    <w:p>
+      <w:pPr>
+        <w:pStyle w:val="FirstParagraph"/>
+        <w:rPr/>
+      </w:pPr>
+      <w:r>
+        <w:rPr>
+          <w:b/>
+          <w:bCs/>
+        </w:rPr>
+        <w:t>GitHub Pages.</w:t>
+      </w:r>
+      <w:r>
+        <w:rPr/>
+        <w:t xml:space="preserve"> Settings → Pages → Source: GitHub Actions; затем любой push в </w:t>
+      </w:r>
+      <w:r>
+        <w:rPr>
+          <w:rStyle w:val="VerbatimChar"/>
+        </w:rPr>
+        <w:t>main</w:t>
+      </w:r>
+      <w:r>
+        <w:rPr/>
+        <w:t xml:space="preserve">. Адрес </w:t>
+      </w:r>
+      <w:r>
+        <w:rPr>
+          <w:rStyle w:val="VerbatimChar"/>
+        </w:rPr>
+        <w:t>https://&lt;логин&gt;.github.io/invest-project-eval/</w:t>
+      </w:r>
+      <w:r>
+        <w:rPr/>
+        <w:t>.</w:t>
+      </w:r>
+    </w:p>
+    <w:p>
+      <w:pPr>
+        <w:pStyle w:val="BodyText"/>
+        <w:rPr/>
+      </w:pPr>
+      <w:r>
+        <w:rPr>
+          <w:b/>
+          <w:bCs/>
+        </w:rPr>
+        <w:t>Cloudflare Pages.</w:t>
+      </w:r>
+      <w:r>
+        <w:rPr/>
+        <w:t xml:space="preserve"> Подключить репозиторий, preset None, build command пустой, output </w:t>
+      </w:r>
+      <w:r>
+        <w:rPr>
+          <w:rStyle w:val="VerbatimChar"/>
+        </w:rPr>
+        <w:t>/</w:t>
+      </w:r>
+      <w:r>
+        <w:rPr/>
+        <w:t>.</w:t>
+      </w:r>
+    </w:p>
+    <w:p>
+      <w:pPr>
+        <w:pStyle w:val="BodyText"/>
+        <w:rPr/>
+      </w:pPr>
+      <w:r>
+        <w:rPr>
+          <w:b/>
+          <w:bCs/>
+        </w:rPr>
+        <w:t>Tilda / любой сайт.</w:t>
+      </w:r>
+      <w:r>
+        <w:rPr/>
+        <w:t xml:space="preserve"> Блок HTML с </w:t>
+      </w:r>
+      <w:r>
+        <w:rPr>
+          <w:rStyle w:val="VerbatimChar"/>
+        </w:rPr>
+        <w:t>&lt;iframe src="…/#/t/express?sample=cafe"&gt;</w:t>
+      </w:r>
+      <w:r>
+        <w:rPr/>
+        <w:t xml:space="preserve">. Ссылки на конкретный шаблон и пример: </w:t>
+      </w:r>
+      <w:r>
+        <w:rPr>
+          <w:rStyle w:val="VerbatimChar"/>
+        </w:rPr>
+        <w:t>#/t/&lt;id&gt;?sample=&lt;sampleId&gt;&amp;level=&lt;express|basic|pro&gt;&amp;tab=&lt;inputs|results|…&gt;</w:t>
+      </w:r>
+      <w:r>
+        <w:rPr/>
+        <w:t>.</w:t>
+      </w:r>
+    </w:p>
+    <w:p>
+      <w:pPr>
+        <w:pStyle w:val="BodyText"/>
+        <w:rPr/>
+      </w:pPr>
+      <w:r>
+        <w:rPr>
+          <w:b/>
+          <w:bCs/>
+        </w:rPr>
+        <w:t>Смена модели ИИ по умолчанию.</w:t>
+      </w:r>
+      <w:r>
+        <w:rPr/>
+        <w:t xml:space="preserve"> Variables </w:t>
+      </w:r>
+      <w:r>
+        <w:rPr>
+          <w:rStyle w:val="VerbatimChar"/>
+        </w:rPr>
+        <w:t>AI_PROVIDER</w:t>
+      </w:r>
+      <w:r>
+        <w:rPr/>
+        <w:t xml:space="preserve">, </w:t>
+      </w:r>
+      <w:r>
+        <w:rPr>
+          <w:rStyle w:val="VerbatimChar"/>
+        </w:rPr>
+        <w:t>AI_BASE_URL</w:t>
+      </w:r>
+      <w:r>
+        <w:rPr/>
+        <w:t xml:space="preserve">, </w:t>
+      </w:r>
+      <w:r>
+        <w:rPr>
+          <w:rStyle w:val="VerbatimChar"/>
+        </w:rPr>
+        <w:t>AI_MODEL</w:t>
+      </w:r>
+      <w:r>
+        <w:rPr/>
+        <w:t xml:space="preserve">, </w:t>
+      </w:r>
+      <w:r>
+        <w:rPr>
+          <w:rStyle w:val="VerbatimChar"/>
+        </w:rPr>
+        <w:t>AI_LABEL</w:t>
+      </w:r>
+      <w:r>
+        <w:rPr/>
+        <w:t xml:space="preserve">, Secret </w:t>
+      </w:r>
+      <w:r>
+        <w:rPr>
+          <w:rStyle w:val="VerbatimChar"/>
+        </w:rPr>
+        <w:t>AI_API_KEY</w:t>
+      </w:r>
+      <w:r>
+        <w:rPr/>
+        <w:t xml:space="preserve"> в Settings → Secrets and variables → Actions; затем push или Re-run workflow. Для боевого ключа — Worker (</w:t>
+      </w:r>
+      <w:r>
+        <w:rPr>
+          <w:rStyle w:val="VerbatimChar"/>
+        </w:rPr>
+        <w:t>wrangler secret put PROVIDER_KEY</w:t>
+      </w:r>
+      <w:r>
+        <w:rPr/>
+        <w:t xml:space="preserve">, </w:t>
+      </w:r>
+      <w:r>
+        <w:rPr>
+          <w:rStyle w:val="VerbatimChar"/>
+        </w:rPr>
+        <w:t>wrangler deploy</w:t>
+      </w:r>
+      <w:r>
+        <w:rPr/>
+        <w:t xml:space="preserve">) и </w:t>
+      </w:r>
+      <w:r>
+        <w:rPr>
+          <w:rStyle w:val="VerbatimChar"/>
+        </w:rPr>
+        <w:t>AI_PROVIDER=webhook</w:t>
+      </w:r>
+      <w:r>
+        <w:rPr/>
+        <w:t>.</w:t>
+      </w:r>
+    </w:p>
+    <w:p>
+      <w:pPr>
+        <w:pStyle w:val="BodyText"/>
+        <w:rPr/>
+      </w:pPr>
+      <w:r>
+        <w:rPr>
+          <w:b/>
+          <w:bCs/>
+        </w:rPr>
+        <w:t>Локальная разработка.</w:t>
+      </w:r>
+      <w:r>
+        <w:rPr/>
+        <w:t xml:space="preserve"> </w:t>
+      </w:r>
+      <w:r>
+        <w:rPr>
+          <w:rStyle w:val="VerbatimChar"/>
+        </w:rPr>
+        <w:t>npx serve .</w:t>
+      </w:r>
+      <w:r>
+        <w:rPr/>
+        <w:t xml:space="preserve"> (или любой статический сервер), ES-модули требуют http(s), не </w:t>
+      </w:r>
+      <w:r>
+        <w:rPr>
+          <w:rStyle w:val="VerbatimChar"/>
+        </w:rPr>
+        <w:t>file://</w:t>
+      </w:r>
+      <w:r>
+        <w:rPr/>
+        <w:t>.</w:t>
+      </w:r>
+    </w:p>
+    <w:p>
+      <w:pPr>
+        <w:pStyle w:val="Normal"/>
+        <w:rPr/>
+      </w:pPr>
+      <w:bookmarkStart w:id="50" w:name="развёртывание-и-эксплуатация"/>
+      <w:r>
+        <w:rPr/>
+        <mc:AlternateContent>
+          <mc:Choice Requires="wps">
+            <w:drawing>
+              <wp:inline distT="0" distB="0" distL="0" distR="0">
+                <wp:extent cx="5943600" cy="19050"/>
+                <wp:effectExtent l="0" t="0" r="0" b="0"/>
+                <wp:docPr id="35" name=""/>
+                <a:graphic xmlns:a="http://schemas.openxmlformats.org/drawingml/2006/main">
+                  <a:graphicData uri="http://schemas.microsoft.com/office/word/2010/wordprocessingShape">
+                    <wps:wsp>
+                      <wps:cNvSpPr/>
+                      <wps:nvSpPr>
+                        <wps:cNvPr id="36" name=""/>
+                        <wps:cNvSpPr/>
+                      </wps:nvSpPr>
+                      <wps:spPr>
+                        <a:xfrm>
+                          <a:off x="0" y="0"/>
+                          <a:ext cx="5943600" cy="19080"/>
+                        </a:xfrm>
+                        <a:prstGeom prst="rect">
+                          <a:avLst/>
+                        </a:prstGeom>
+                        <a:solidFill>
+                          <a:srgbClr val="ffffff"/>
+                        </a:solidFill>
+                        <a:ln w="0">
+                          <a:solidFill>
+                            <a:srgbClr val="000000"/>
+                          </a:solidFill>
+                        </a:ln>
+                      </wps:spPr>
+                      <wps:bodyPr/>
+                    </wps:wsp>
+                  </a:graphicData>
+                </a:graphic>
+                <wp14:sizeRelH relativeFrom="page">
+                  <wp14:pctWidth>100000</wp14:pctWidth>
+                </wp14:sizeRelH>
+              </wp:inline>
+            </w:drawing>
+          </mc:Choice>
+          <mc:Fallback>
+            <w:pict>
+              <v:rect id="shape_0" fillcolor="white" stroked="t" o:allowincell="f" style="position:absolute;margin-left:0pt;margin-top:-1.55pt;width:467.95pt;height:1.45pt;mso-wrap-style:none;v-text-anchor:middle;mso-position-horizontal:center;mso-position-vertical:top">
+                <v:fill o:detectmouseclick="t" type="solid" color2="black"/>
+                <v:stroke color="black" joinstyle="round" endcap="flat"/>
+                <w10:wrap type="topAndBottom"/>
+              </v:rect>
+            </w:pict>
+          </mc:Fallback>
+        </mc:AlternateContent>
+      </w:r>
+      <w:bookmarkEnd w:id="50"/>
+    </w:p>
+    <w:p>
+      <w:pPr>
+        <w:pStyle w:val="Heading2"/>
+        <w:rPr/>
+      </w:pPr>
+      <w:bookmarkStart w:id="51" w:name="ограничения-и-возможные-доработки"/>
       <w:r>
         <w:rPr/>
         <w:t>13. Ограничения и возможные доработки</w:t>
@@ -19439,14 +20620,14 @@
         <w:spacing w:before="36" w:after="36"/>
         <w:rPr/>
       </w:pPr>
-      <w:bookmarkStart w:id="50" w:name="X9015090818f56e3cfea0bb744ce4fcc4601082f"/>
-      <w:bookmarkStart w:id="51" w:name="ограничения-и-возможные-доработки"/>
+      <w:bookmarkStart w:id="52" w:name="X9015090818f56e3cfea0bb744ce4fcc4601082f"/>
+      <w:bookmarkStart w:id="53" w:name="ограничения-и-возможные-доработки"/>
       <w:r>
         <w:rPr/>
         <w:t>Возможные доработки: помесячные модели проектов с годовой агрегацией, сравнение версий модели, совместная работа через серверное хранилище, импорт из 1С/CRM через n8n, пакетная оценка портфеля проектов.</w:t>
       </w:r>
-      <w:bookmarkEnd w:id="50"/>
-      <w:bookmarkEnd w:id="51"/>
+      <w:bookmarkEnd w:id="52"/>
+      <w:bookmarkEnd w:id="53"/>
     </w:p>
     <w:sectPr>
       <w:type w:val="nextPage"/>

</xml_diff>